<commit_message>
Sincronización final: Buscador traducido y archivos base
</commit_message>
<xml_diff>
--- a/notas.docx
+++ b/notas.docx
@@ -3,756 +3,33 @@
 <w:document xmlns:wpc="http://schemas.microsoft.com/office/word/2010/wordprocessingCanvas" xmlns:cx="http://schemas.microsoft.com/office/drawing/2014/chartex" xmlns:cx1="http://schemas.microsoft.com/office/drawing/2015/9/8/chartex" xmlns:cx2="http://schemas.microsoft.com/office/drawing/2015/10/21/chartex" xmlns:cx3="http://schemas.microsoft.com/office/drawing/2016/5/9/chartex" xmlns:cx4="http://schemas.microsoft.com/office/drawing/2016/5/10/chartex" xmlns:cx5="http://schemas.microsoft.com/office/drawing/2016/5/11/chartex" xmlns:cx6="http://schemas.microsoft.com/office/drawing/2016/5/12/chartex" xmlns:cx7="http://schemas.microsoft.com/office/drawing/2016/5/13/chartex" xmlns:cx8="http://schemas.microsoft.com/office/drawing/2016/5/14/chartex" xmlns:mc="http://schemas.openxmlformats.org/markup-compatibility/2006" xmlns:aink="http://schemas.microsoft.com/office/drawing/2016/ink" xmlns:am3d="http://schemas.microsoft.com/office/drawing/2017/model3d" xmlns:o="urn:schemas-microsoft-com:office:office" xmlns:r="http://schemas.openxmlformats.org/officeDocument/2006/relationships" xmlns:m="http://schemas.openxmlformats.org/officeDocument/2006/math" xmlns:v="urn:schemas-microsoft-com:vml" xmlns:wp14="http://schemas.microsoft.com/office/word/2010/wordprocessingDrawing" xmlns:wp="http://schemas.openxmlformats.org/drawingml/2006/wordprocessingDrawing" xmlns:w10="urn:schemas-microsoft-com:office:word" xmlns:w="http://schemas.openxmlformats.org/wordprocessingml/2006/main" xmlns:w14="http://schemas.microsoft.com/office/word/2010/wordml" xmlns:w15="http://schemas.microsoft.com/office/word/2012/wordml" xmlns:w16cex="http://schemas.microsoft.com/office/word/2018/wordml/cex" xmlns:w16cid="http://schemas.microsoft.com/office/word/2016/wordml/cid" xmlns:w16="http://schemas.microsoft.com/office/word/2018/wordml" xmlns:w16sdtdh="http://schemas.microsoft.com/office/word/2020/wordml/sdtdatahash" xmlns:w16se="http://schemas.microsoft.com/office/word/2015/wordml/symex" xmlns:wpg="http://schemas.microsoft.com/office/word/2010/wordprocessingGroup" xmlns:wpi="http://schemas.microsoft.com/office/word/2010/wordprocessingInk" xmlns:wne="http://schemas.microsoft.com/office/word/2006/wordml" xmlns:wps="http://schemas.microsoft.com/office/word/2010/wordprocessingShape" mc:Ignorable="w14 w15 w16se w16cid w16 w16cex w16sdtdh wp14">
   <w:body>
     <w:p>
+      <w:pPr>
+        <w:rPr>
+          <w:rFonts w:ascii="Segoe UI Emoji" w:hAnsi="Segoe UI Emoji" w:cs="Segoe UI Emoji"/>
+          <w:lang w:val="es-MX"/>
+        </w:rPr>
+      </w:pPr>
       <w:r>
         <w:rPr>
           <w:rFonts w:ascii="Segoe UI Emoji" w:hAnsi="Segoe UI Emoji" w:cs="Segoe UI Emoji"/>
+          <w:lang w:val="es-MX"/>
         </w:rPr>
-        <w:t>📁</w:t>
-      </w:r>
-      <w:r>
-        <w:t> Archivos principales a modificar:</w:t>
+        <w:t>Series de pasos</w:t>
       </w:r>
     </w:p>
     <w:p>
       <w:pPr>
         <w:rPr>
-          <w:b/>
-          <w:bCs/>
+          <w:lang w:val="es-MX"/>
         </w:rPr>
       </w:pPr>
       <w:r>
         <w:rPr>
-          <w:b/>
-          <w:bCs/>
+          <w:lang w:val="es-MX"/>
         </w:rPr>
-        <w:t>1. consulta/</w:t>
-      </w:r>
-      <w:proofErr w:type="spellStart"/>
-      <w:r>
-        <w:rPr>
-          <w:b/>
-          <w:bCs/>
-        </w:rPr>
-        <w:t>head.php</w:t>
-      </w:r>
-      <w:proofErr w:type="spellEnd"/>
-    </w:p>
-    <w:p>
-      <w:r>
-        <w:t>Aquí debes incluir los CSS y JS de Select2</w:t>
+        <w:t>https://chat.deepseek.com/share/7ks3160m7w52y5uwuf</w:t>
       </w:r>
     </w:p>
-    <w:p>
-      <w:r>
-        <w:t>Agrega estas líneas antes de cerrar el &lt;/head&gt;:</w:t>
-      </w:r>
-    </w:p>
-    <w:p>
-      <w:proofErr w:type="spellStart"/>
-      <w:r>
-        <w:t>php</w:t>
-      </w:r>
-      <w:proofErr w:type="spellEnd"/>
-    </w:p>
-    <w:p>
-      <w:proofErr w:type="gramStart"/>
-      <w:r>
-        <w:t>&lt;!--</w:t>
-      </w:r>
-      <w:proofErr w:type="gramEnd"/>
-      <w:r>
-        <w:t xml:space="preserve"> Select2 CSS --&gt;</w:t>
-      </w:r>
-    </w:p>
-    <w:p>
-      <w:r>
-        <w:t xml:space="preserve">&lt;link href="https://cdnjs.cloudflare.com/ajax/libs/select2/4.0.13/css/select2.min.css" </w:t>
-      </w:r>
-      <w:proofErr w:type="spellStart"/>
-      <w:r>
-        <w:t>rel</w:t>
-      </w:r>
-      <w:proofErr w:type="spellEnd"/>
-      <w:r>
-        <w:t>="</w:t>
-      </w:r>
-      <w:proofErr w:type="spellStart"/>
-      <w:r>
-        <w:t>stylesheet</w:t>
-      </w:r>
-      <w:proofErr w:type="spellEnd"/>
-      <w:r>
-        <w:t>" /&gt;</w:t>
-      </w:r>
-    </w:p>
-    <w:p>
-      <w:proofErr w:type="gramStart"/>
-      <w:r>
-        <w:t>&lt;!--</w:t>
-      </w:r>
-      <w:proofErr w:type="gramEnd"/>
-      <w:r>
-        <w:t xml:space="preserve"> Select2 JS --&gt;</w:t>
-      </w:r>
-    </w:p>
-    <w:p>
-      <w:r>
-        <w:t>&lt;script src="https://cdnjs.cloudflare.com/ajax/libs/select2/4.0.13/js/select2.min.js"&gt;&lt;/script&gt;</w:t>
-      </w:r>
-    </w:p>
-    <w:p/>
-    <w:p>
-      <w:proofErr w:type="gramStart"/>
-      <w:r>
-        <w:t>&lt;!--</w:t>
-      </w:r>
-      <w:proofErr w:type="gramEnd"/>
-      <w:r>
-        <w:t xml:space="preserve"> Si prefieres usar versión local, descarga y guarda en: --&gt;</w:t>
-      </w:r>
-    </w:p>
-    <w:p>
-      <w:proofErr w:type="gramStart"/>
-      <w:r>
-        <w:t>&lt;!--</w:t>
-      </w:r>
-      <w:proofErr w:type="gramEnd"/>
-      <w:r>
-        <w:t xml:space="preserve"> </w:t>
-      </w:r>
-      <w:proofErr w:type="spellStart"/>
-      <w:r>
-        <w:t>css</w:t>
-      </w:r>
-      <w:proofErr w:type="spellEnd"/>
-      <w:r>
-        <w:t>/select2.min.css y scripts/select2.min.js --&gt;</w:t>
-      </w:r>
-    </w:p>
-    <w:p>
-      <w:pPr>
-        <w:rPr>
-          <w:b/>
-          <w:bCs/>
-        </w:rPr>
-      </w:pPr>
-      <w:r>
-        <w:rPr>
-          <w:b/>
-          <w:bCs/>
-        </w:rPr>
-        <w:t>2. consulta/</w:t>
-      </w:r>
-      <w:proofErr w:type="spellStart"/>
-      <w:r>
-        <w:rPr>
-          <w:b/>
-          <w:bCs/>
-        </w:rPr>
-        <w:t>index.php</w:t>
-      </w:r>
-      <w:proofErr w:type="spellEnd"/>
-    </w:p>
-    <w:p>
-      <w:r>
-        <w:t>Aquí están probablemente tus formularios de búsqueda</w:t>
-      </w:r>
-    </w:p>
-    <w:p>
-      <w:r>
-        <w:t>Busca los elementos &lt;</w:t>
-      </w:r>
-      <w:proofErr w:type="spellStart"/>
-      <w:r>
-        <w:t>select</w:t>
-      </w:r>
-      <w:proofErr w:type="spellEnd"/>
-      <w:r>
-        <w:t>&gt; y agrega la clase select2</w:t>
-      </w:r>
-    </w:p>
-    <w:p>
-      <w:pPr>
-        <w:rPr>
-          <w:b/>
-          <w:bCs/>
-        </w:rPr>
-      </w:pPr>
-      <w:r>
-        <w:rPr>
-          <w:b/>
-          <w:bCs/>
-        </w:rPr>
-        <w:t>3. scripts/common.js</w:t>
-      </w:r>
-    </w:p>
-    <w:p>
-      <w:r>
-        <w:t>Aquí inicializa Select2 para todos los elementos</w:t>
-      </w:r>
-    </w:p>
-    <w:p>
-      <w:r>
-        <w:t>Agrega este código:</w:t>
-      </w:r>
-    </w:p>
-    <w:p>
-      <w:proofErr w:type="spellStart"/>
-      <w:r>
-        <w:t>javascript</w:t>
-      </w:r>
-      <w:proofErr w:type="spellEnd"/>
-    </w:p>
-    <w:p>
-      <w:r>
-        <w:t>$(</w:t>
-      </w:r>
-      <w:proofErr w:type="spellStart"/>
-      <w:r>
-        <w:t>document</w:t>
-      </w:r>
-      <w:proofErr w:type="spellEnd"/>
-      <w:proofErr w:type="gramStart"/>
-      <w:r>
-        <w:t>).</w:t>
-      </w:r>
-      <w:proofErr w:type="spellStart"/>
-      <w:r>
-        <w:t>ready</w:t>
-      </w:r>
-      <w:proofErr w:type="spellEnd"/>
-      <w:proofErr w:type="gramEnd"/>
-      <w:r>
-        <w:t>(</w:t>
-      </w:r>
-      <w:proofErr w:type="spellStart"/>
-      <w:r>
-        <w:t>function</w:t>
-      </w:r>
-      <w:proofErr w:type="spellEnd"/>
-      <w:r>
-        <w:t>() {</w:t>
-      </w:r>
-    </w:p>
-    <w:p>
-      <w:r>
-        <w:t xml:space="preserve">    // Inicializar Select2 para todos los </w:t>
-      </w:r>
-      <w:proofErr w:type="spellStart"/>
-      <w:r>
-        <w:t>select</w:t>
-      </w:r>
-      <w:proofErr w:type="spellEnd"/>
-      <w:r>
-        <w:t xml:space="preserve"> con la clase</w:t>
-      </w:r>
-    </w:p>
-    <w:p>
-      <w:r>
-        <w:t xml:space="preserve">    $(</w:t>
-      </w:r>
-      <w:proofErr w:type="gramStart"/>
-      <w:r>
-        <w:t>'.select</w:t>
-      </w:r>
-      <w:proofErr w:type="gramEnd"/>
-      <w:r>
-        <w:t>2').select2({</w:t>
-      </w:r>
-    </w:p>
-    <w:p>
-      <w:r>
-        <w:t xml:space="preserve">        </w:t>
-      </w:r>
-      <w:proofErr w:type="spellStart"/>
-      <w:r>
-        <w:t>placeholder</w:t>
-      </w:r>
-      <w:proofErr w:type="spellEnd"/>
-      <w:r>
-        <w:t>: "Seleccionar...",</w:t>
-      </w:r>
-    </w:p>
-    <w:p>
-      <w:r>
-        <w:t xml:space="preserve">        </w:t>
-      </w:r>
-      <w:proofErr w:type="spellStart"/>
-      <w:r>
-        <w:t>allowClear</w:t>
-      </w:r>
-      <w:proofErr w:type="spellEnd"/>
-      <w:r>
-        <w:t>: true</w:t>
-      </w:r>
-    </w:p>
-    <w:p>
-      <w:r>
-        <w:t xml:space="preserve">    });</w:t>
-      </w:r>
-    </w:p>
-    <w:p>
-      <w:r>
-        <w:t xml:space="preserve">    </w:t>
-      </w:r>
-    </w:p>
-    <w:p>
-      <w:r>
-        <w:t xml:space="preserve">    // O inicializar por ID específico</w:t>
-      </w:r>
-    </w:p>
-    <w:p>
-      <w:r>
-        <w:t xml:space="preserve">    $('#id-de-tu-</w:t>
-      </w:r>
-      <w:proofErr w:type="spellStart"/>
-      <w:r>
-        <w:t>select</w:t>
-      </w:r>
-      <w:proofErr w:type="spellEnd"/>
-      <w:r>
-        <w:t>'</w:t>
-      </w:r>
-      <w:proofErr w:type="gramStart"/>
-      <w:r>
-        <w:t>).select</w:t>
-      </w:r>
-      <w:proofErr w:type="gramEnd"/>
-      <w:r>
-        <w:t>2();</w:t>
-      </w:r>
-    </w:p>
-    <w:p>
-      <w:r>
-        <w:t>});</w:t>
-      </w:r>
-    </w:p>
-    <w:p>
-      <w:r>
-        <w:rPr>
-          <w:rFonts w:ascii="Segoe UI Emoji" w:hAnsi="Segoe UI Emoji" w:cs="Segoe UI Emoji"/>
-        </w:rPr>
-        <w:t>🔧</w:t>
-      </w:r>
-      <w:r>
-        <w:t> Pasos específicos:</w:t>
-      </w:r>
-    </w:p>
-    <w:p>
-      <w:pPr>
-        <w:rPr>
-          <w:b/>
-          <w:bCs/>
-        </w:rPr>
-      </w:pPr>
-      <w:r>
-        <w:rPr>
-          <w:b/>
-          <w:bCs/>
-        </w:rPr>
-        <w:lastRenderedPageBreak/>
-        <w:t>Paso 1: Editar consulta/</w:t>
-      </w:r>
-      <w:proofErr w:type="spellStart"/>
-      <w:r>
-        <w:rPr>
-          <w:b/>
-          <w:bCs/>
-        </w:rPr>
-        <w:t>head.php</w:t>
-      </w:r>
-      <w:proofErr w:type="spellEnd"/>
-    </w:p>
-    <w:p>
-      <w:proofErr w:type="spellStart"/>
-      <w:r>
-        <w:t>php</w:t>
-      </w:r>
-      <w:proofErr w:type="spellEnd"/>
-    </w:p>
-    <w:p>
-      <w:proofErr w:type="gramStart"/>
-      <w:r>
-        <w:t>&lt;!--</w:t>
-      </w:r>
-      <w:proofErr w:type="gramEnd"/>
-      <w:r>
-        <w:t xml:space="preserve"> Después de otros CSS --&gt;</w:t>
-      </w:r>
-    </w:p>
-    <w:p>
-      <w:r>
-        <w:t xml:space="preserve">&lt;link href="https://cdnjs.cloudflare.com/ajax/libs/select2/4.0.13/css/select2.min.css" </w:t>
-      </w:r>
-      <w:proofErr w:type="spellStart"/>
-      <w:r>
-        <w:t>rel</w:t>
-      </w:r>
-      <w:proofErr w:type="spellEnd"/>
-      <w:r>
-        <w:t>="</w:t>
-      </w:r>
-      <w:proofErr w:type="spellStart"/>
-      <w:r>
-        <w:t>stylesheet</w:t>
-      </w:r>
-      <w:proofErr w:type="spellEnd"/>
-      <w:r>
-        <w:t>" /&gt;</w:t>
-      </w:r>
-    </w:p>
-    <w:p/>
-    <w:p>
-      <w:proofErr w:type="gramStart"/>
-      <w:r>
-        <w:t>&lt;!--</w:t>
-      </w:r>
-      <w:proofErr w:type="gramEnd"/>
-      <w:r>
-        <w:t xml:space="preserve"> Antes de cerrar &lt;/head&gt; --&gt;</w:t>
-      </w:r>
-    </w:p>
-    <w:p>
-      <w:r>
-        <w:t>&lt;script src="https://cdnjs.cloudflare.com/ajax/libs/select2/4.0.13/js/select2.min.js"&gt;&lt;/script&gt;</w:t>
-      </w:r>
-    </w:p>
-    <w:p>
-      <w:pPr>
-        <w:rPr>
-          <w:b/>
-          <w:bCs/>
-        </w:rPr>
-      </w:pPr>
-      <w:r>
-        <w:rPr>
-          <w:b/>
-          <w:bCs/>
-        </w:rPr>
-        <w:t>Paso 2: Editar consulta/</w:t>
-      </w:r>
-      <w:proofErr w:type="spellStart"/>
-      <w:r>
-        <w:rPr>
-          <w:b/>
-          <w:bCs/>
-        </w:rPr>
-        <w:t>index.php</w:t>
-      </w:r>
-      <w:proofErr w:type="spellEnd"/>
-    </w:p>
-    <w:p>
-      <w:r>
-        <w:t xml:space="preserve">Busca tus elementos </w:t>
-      </w:r>
-      <w:proofErr w:type="spellStart"/>
-      <w:r>
-        <w:t>select</w:t>
-      </w:r>
-      <w:proofErr w:type="spellEnd"/>
-      <w:r>
-        <w:t xml:space="preserve"> y modifícalos:</w:t>
-      </w:r>
-    </w:p>
-    <w:p>
-      <w:proofErr w:type="spellStart"/>
-      <w:r>
-        <w:t>html</w:t>
-      </w:r>
-      <w:proofErr w:type="spellEnd"/>
-    </w:p>
-    <w:p>
-      <w:proofErr w:type="gramStart"/>
-      <w:r>
-        <w:t>&lt;!--</w:t>
-      </w:r>
-      <w:proofErr w:type="gramEnd"/>
-      <w:r>
-        <w:t xml:space="preserve"> Cambiar de: --&gt;</w:t>
-      </w:r>
-    </w:p>
-    <w:p>
-      <w:r>
-        <w:t>&lt;</w:t>
-      </w:r>
-      <w:proofErr w:type="spellStart"/>
-      <w:r>
-        <w:t>select</w:t>
-      </w:r>
-      <w:proofErr w:type="spellEnd"/>
-      <w:r>
-        <w:t xml:space="preserve"> </w:t>
-      </w:r>
-      <w:proofErr w:type="spellStart"/>
-      <w:r>
-        <w:t>name</w:t>
-      </w:r>
-      <w:proofErr w:type="spellEnd"/>
-      <w:r>
-        <w:t>="</w:t>
-      </w:r>
-      <w:proofErr w:type="spellStart"/>
-      <w:r>
-        <w:t>campo_busqueda</w:t>
-      </w:r>
-      <w:proofErr w:type="spellEnd"/>
-      <w:r>
-        <w:t>" id="</w:t>
-      </w:r>
-      <w:proofErr w:type="spellStart"/>
-      <w:r>
-        <w:t>campo_busqueda</w:t>
-      </w:r>
-      <w:proofErr w:type="spellEnd"/>
-      <w:r>
-        <w:t>"&gt;</w:t>
-      </w:r>
-    </w:p>
-    <w:p>
-      <w:r>
-        <w:t xml:space="preserve">    &lt;</w:t>
-      </w:r>
-      <w:proofErr w:type="spellStart"/>
-      <w:r>
-        <w:t>option</w:t>
-      </w:r>
-      <w:proofErr w:type="spellEnd"/>
-      <w:r>
-        <w:t xml:space="preserve"> </w:t>
-      </w:r>
-      <w:proofErr w:type="spellStart"/>
-      <w:r>
-        <w:t>value</w:t>
-      </w:r>
-      <w:proofErr w:type="spellEnd"/>
-      <w:r>
-        <w:t>=""&gt;Seleccionar&lt;/</w:t>
-      </w:r>
-      <w:proofErr w:type="spellStart"/>
-      <w:r>
-        <w:t>option</w:t>
-      </w:r>
-      <w:proofErr w:type="spellEnd"/>
-      <w:r>
-        <w:t>&gt;</w:t>
-      </w:r>
-    </w:p>
-    <w:p>
-      <w:r>
-        <w:t xml:space="preserve">    </w:t>
-      </w:r>
-      <w:proofErr w:type="gramStart"/>
-      <w:r>
-        <w:t>&lt;!--</w:t>
-      </w:r>
-      <w:proofErr w:type="gramEnd"/>
-      <w:r>
-        <w:t xml:space="preserve"> opciones --&gt;</w:t>
-      </w:r>
-    </w:p>
-    <w:p>
-      <w:r>
-        <w:t>&lt;/</w:t>
-      </w:r>
-      <w:proofErr w:type="spellStart"/>
-      <w:r>
-        <w:t>select</w:t>
-      </w:r>
-      <w:proofErr w:type="spellEnd"/>
-      <w:r>
-        <w:t>&gt;</w:t>
-      </w:r>
-    </w:p>
-    <w:p/>
-    <w:p>
-      <w:proofErr w:type="gramStart"/>
-      <w:r>
-        <w:t>&lt;!--</w:t>
-      </w:r>
-      <w:proofErr w:type="gramEnd"/>
-      <w:r>
-        <w:t xml:space="preserve"> A: --&gt;</w:t>
-      </w:r>
-    </w:p>
-    <w:p>
-      <w:r>
-        <w:t>&lt;</w:t>
-      </w:r>
-      <w:proofErr w:type="spellStart"/>
-      <w:r>
-        <w:t>select</w:t>
-      </w:r>
-      <w:proofErr w:type="spellEnd"/>
-      <w:r>
-        <w:t xml:space="preserve"> </w:t>
-      </w:r>
-      <w:proofErr w:type="spellStart"/>
-      <w:r>
-        <w:t>name</w:t>
-      </w:r>
-      <w:proofErr w:type="spellEnd"/>
-      <w:r>
-        <w:t>="</w:t>
-      </w:r>
-      <w:proofErr w:type="spellStart"/>
-      <w:r>
-        <w:t>campo_busqueda</w:t>
-      </w:r>
-      <w:proofErr w:type="spellEnd"/>
-      <w:r>
-        <w:t>" id="</w:t>
-      </w:r>
-      <w:proofErr w:type="spellStart"/>
-      <w:r>
-        <w:t>campo_busqueda</w:t>
-      </w:r>
-      <w:proofErr w:type="spellEnd"/>
-      <w:r>
-        <w:t xml:space="preserve">" </w:t>
-      </w:r>
-      <w:proofErr w:type="spellStart"/>
-      <w:r>
-        <w:t>class</w:t>
-      </w:r>
-      <w:proofErr w:type="spellEnd"/>
-      <w:r>
-        <w:t>="select2"&gt;</w:t>
-      </w:r>
-    </w:p>
-    <w:p>
-      <w:r>
-        <w:t xml:space="preserve">    &lt;</w:t>
-      </w:r>
-      <w:proofErr w:type="spellStart"/>
-      <w:r>
-        <w:t>option</w:t>
-      </w:r>
-      <w:proofErr w:type="spellEnd"/>
-      <w:r>
-        <w:t xml:space="preserve"> </w:t>
-      </w:r>
-      <w:proofErr w:type="spellStart"/>
-      <w:r>
-        <w:t>value</w:t>
-      </w:r>
-      <w:proofErr w:type="spellEnd"/>
-      <w:r>
-        <w:t>=""&gt;Seleccionar&lt;/</w:t>
-      </w:r>
-      <w:proofErr w:type="spellStart"/>
-      <w:r>
-        <w:t>option</w:t>
-      </w:r>
-      <w:proofErr w:type="spellEnd"/>
-      <w:r>
-        <w:t>&gt;</w:t>
-      </w:r>
-    </w:p>
-    <w:p>
-      <w:r>
-        <w:t xml:space="preserve">    </w:t>
-      </w:r>
-      <w:proofErr w:type="gramStart"/>
-      <w:r>
-        <w:t>&lt;!--</w:t>
-      </w:r>
-      <w:proofErr w:type="gramEnd"/>
-      <w:r>
-        <w:t xml:space="preserve"> opciones --&gt;</w:t>
-      </w:r>
-    </w:p>
-    <w:p>
-      <w:r>
-        <w:t>&lt;/</w:t>
-      </w:r>
-      <w:proofErr w:type="spellStart"/>
-      <w:r>
-        <w:t>select</w:t>
-      </w:r>
-      <w:proofErr w:type="spellEnd"/>
-      <w:r>
-        <w:t>&gt;</w:t>
-      </w:r>
-    </w:p>
-    <w:p>
-      <w:pPr>
-        <w:rPr>
-          <w:b/>
-          <w:bCs/>
-        </w:rPr>
-      </w:pPr>
-      <w:r>
-        <w:rPr>
-          <w:b/>
-          <w:bCs/>
-        </w:rPr>
-        <w:t>Paso 3: Editar scripts/common.js</w:t>
-      </w:r>
-    </w:p>
-    <w:p>
-      <w:r>
-        <w:t>Agrega la inicialización de Select2.</w:t>
-      </w:r>
-    </w:p>
-    <w:p>
-      <w:r>
-        <w:rPr>
-          <w:rFonts w:ascii="Segoe UI Emoji" w:hAnsi="Segoe UI Emoji" w:cs="Segoe UI Emoji"/>
-        </w:rPr>
-        <w:t>🎯</w:t>
-      </w:r>
-      <w:r>
-        <w:t xml:space="preserve"> Archivos donde probablemente están tus </w:t>
-      </w:r>
-      <w:proofErr w:type="spellStart"/>
-      <w:r>
-        <w:t>dropdowns</w:t>
-      </w:r>
-      <w:proofErr w:type="spellEnd"/>
-      <w:r>
-        <w:t>:</w:t>
-      </w:r>
-    </w:p>
-    <w:p>
-      <w:r>
-        <w:t>consulta/</w:t>
-      </w:r>
-      <w:proofErr w:type="spellStart"/>
-      <w:r>
-        <w:t>index.php</w:t>
-      </w:r>
-      <w:proofErr w:type="spellEnd"/>
-      <w:r>
-        <w:t> - Página principal con búsquedas</w:t>
-      </w:r>
-    </w:p>
-    <w:p>
-      <w:r>
-        <w:t>consulta/</w:t>
-      </w:r>
-      <w:proofErr w:type="spellStart"/>
-      <w:r>
-        <w:t>editar.php</w:t>
-      </w:r>
-      <w:proofErr w:type="spellEnd"/>
-      <w:r>
-        <w:t> - Formularios de edición</w:t>
-      </w:r>
-    </w:p>
-    <w:p>
-      <w:r>
-        <w:t>consulta/</w:t>
-      </w:r>
-      <w:proofErr w:type="spellStart"/>
-      <w:r>
-        <w:t>registro.php</w:t>
-      </w:r>
-      <w:proofErr w:type="spellEnd"/>
-      <w:r>
-        <w:t> - Formularios de registro</w:t>
-      </w:r>
-    </w:p>
-    <w:p/>
     <w:sectPr>
       <w:pgSz w:w="11906" w:h="16838"/>
       <w:pgMar w:top="1417" w:right="1701" w:bottom="1417" w:left="1701" w:header="708" w:footer="708" w:gutter="0"/>

</xml_diff>